<commit_message>
security: remove hardcoded API key from config files
- Replace hardcoded GROQ_API_KEY with environment variable only
- Create .env.example templates for both backend and cmed_demo
- Update .gitignore to properly exclude qdrant_storage directories
- Fix stream parameter error in shunt_classification_and_ligation_llm.py

Users should now set GROQ_API_KEY via .env file in their local environment.

⚠️ SECURITY NOTE: The exposed key should be regenerated immediately
in your Groq account (https://console.groq.com/keys)

Co-Authored-By: Claude Haiku 4.5 <noreply@anthropic.com>
</commit_message>
<xml_diff>
--- a/backend/Knowledgebases/Ligation_Knowledgebase_1.docx
+++ b/backend/Knowledgebases/Ligation_Knowledgebase_1.docx
@@ -25,7 +25,15 @@
       </w:r>
       <w:proofErr w:type="gramEnd"/>
       <w:r>
-        <w:t xml:space="preserve"> In the first time it acts upon N2-N3 leakage point (the saphenous vein develops a new re-entry perforating vein on N2 transforming the Type 3 shunt into a Type 1 shunt).--- In the second time the N1-N2 leakage point is closed</w:t>
+        <w:t xml:space="preserve"> In the first time it acts upon N2-N3 leakage point (the saphenous vein develops a new re-entry perforating vein on N2 transforming the Type 3 shunt into a Type 1 shunt</w:t>
+      </w:r>
+      <w:proofErr w:type="gramStart"/>
+      <w:r>
+        <w:t>).---</w:t>
+      </w:r>
+      <w:proofErr w:type="gramEnd"/>
+      <w:r>
+        <w:t xml:space="preserve"> In the second time the N1-N2 leakage point is closed</w:t>
       </w:r>
       <w:r>
         <w:t>.</w:t>
@@ -146,39 +154,7 @@
         <w:t xml:space="preserve"> </w:t>
       </w:r>
       <w:r>
-        <w:t xml:space="preserve">absence, an interruption of the N1-N2 leaking point would lead to a not-draining venous system, because of the energy gradient suppression (see therapeutic </w:t>
-      </w:r>
-      <w:proofErr w:type="spellStart"/>
-      <w:r>
-        <w:t>strat</w:t>
-      </w:r>
-      <w:proofErr w:type="spellEnd"/>
-      <w:r>
-        <w:t xml:space="preserve"> </w:t>
-      </w:r>
-      <w:proofErr w:type="spellStart"/>
-      <w:r>
-        <w:t>egy</w:t>
-      </w:r>
-      <w:proofErr w:type="spellEnd"/>
-      <w:r>
-        <w:t xml:space="preserve"> chapter). In type 2 shunt (Figure 5a), the leaking point is only from N2 to N3, with a re-entry perforator focused on the same incompetent tributary and draining toward N1. In this pattern, no recirculation is created, so </w:t>
-      </w:r>
-      <w:proofErr w:type="spellStart"/>
-      <w:r>
-        <w:t>estab</w:t>
-      </w:r>
-      <w:proofErr w:type="spellEnd"/>
-      <w:r>
-        <w:t xml:space="preserve"> </w:t>
-      </w:r>
-      <w:proofErr w:type="spellStart"/>
-      <w:r>
-        <w:t>lishing</w:t>
-      </w:r>
-      <w:proofErr w:type="spellEnd"/>
-      <w:r>
-        <w:t xml:space="preserve"> an ODS.</w:t>
+        <w:t>absence, an interruption of the N1-N2 leaking point would lead to a not-draining venous system, because of the energy gradient suppression (see therapeutic strategy chapter). In type 2 shunt (Figure 5a), the leaking point is only from N2 to N3, with a re-entry perforator focused on the same incompetent tributary and draining toward N1. In this pattern, no recirculation is created, so establishing an ODS.</w:t>
       </w:r>
     </w:p>
     <w:p/>
@@ -700,10 +676,7 @@
         <w:t>(</w:t>
       </w:r>
       <w:r>
-        <w:t>i.e.</w:t>
-      </w:r>
-      <w:r>
-        <w:t xml:space="preserve"> </w:t>
+        <w:t xml:space="preserve">i.e. </w:t>
       </w:r>
       <w:r>
         <w:t>high</w:t>
@@ -715,25 +688,208 @@
         <w:t>ligation)</w:t>
       </w:r>
       <w:r>
-        <w:t xml:space="preserve"> </w:t>
-      </w:r>
-      <w:r>
-        <w:t>done for a type-1 shunt</w:t>
+        <w:t xml:space="preserve"> done for a type-1 shunt.</w:t>
+      </w:r>
+      <w:r>
+        <w:t xml:space="preserve"> In</w:t>
+      </w:r>
+      <w:r>
+        <w:t xml:space="preserve"> </w:t>
+      </w:r>
+      <w:r>
+        <w:t>case</w:t>
+      </w:r>
+      <w:r>
+        <w:t xml:space="preserve"> </w:t>
+      </w:r>
+      <w:r>
+        <w:t>the</w:t>
+      </w:r>
+      <w:r>
+        <w:t xml:space="preserve"> </w:t>
+      </w:r>
+      <w:r>
+        <w:t>saphenous</w:t>
+      </w:r>
+      <w:r>
+        <w:t xml:space="preserve"> </w:t>
+      </w:r>
+      <w:r>
+        <w:t>reflux</w:t>
+      </w:r>
+      <w:r>
+        <w:t xml:space="preserve"> </w:t>
+      </w:r>
+      <w:r>
+        <w:t>was</w:t>
+      </w:r>
+      <w:r>
+        <w:t xml:space="preserve"> </w:t>
+      </w:r>
+      <w:r>
+        <w:t>fed</w:t>
+      </w:r>
+      <w:r>
+        <w:t xml:space="preserve"> </w:t>
+      </w:r>
+      <w:r>
+        <w:t>just</w:t>
+      </w:r>
+      <w:r>
+        <w:t xml:space="preserve"> </w:t>
+      </w:r>
+      <w:r>
+        <w:t>by</w:t>
+      </w:r>
+      <w:r>
+        <w:t xml:space="preserve"> </w:t>
+      </w:r>
+      <w:r>
+        <w:t>a</w:t>
+      </w:r>
+      <w:r>
+        <w:t xml:space="preserve"> </w:t>
+      </w:r>
+      <w:r>
+        <w:t>vessel</w:t>
+      </w:r>
+      <w:r>
+        <w:t xml:space="preserve"> </w:t>
+      </w:r>
+      <w:r>
+        <w:t>dilation</w:t>
+      </w:r>
+      <w:r>
+        <w:t xml:space="preserve"> </w:t>
+      </w:r>
+      <w:r>
+        <w:t>linked</w:t>
+      </w:r>
+      <w:r>
+        <w:t xml:space="preserve"> </w:t>
+      </w:r>
+      <w:r>
+        <w:t>to</w:t>
+      </w:r>
+      <w:r>
+        <w:t xml:space="preserve"> </w:t>
+      </w:r>
+      <w:r>
+        <w:t>the</w:t>
+      </w:r>
+      <w:r>
+        <w:t xml:space="preserve"> </w:t>
+      </w:r>
+      <w:r>
+        <w:t>N3</w:t>
+      </w:r>
+      <w:r>
+        <w:t xml:space="preserve"> </w:t>
+      </w:r>
+      <w:r>
+        <w:t>aspiration, the</w:t>
+      </w:r>
+      <w:r>
+        <w:t xml:space="preserve"> </w:t>
+      </w:r>
+      <w:r>
+        <w:t>N2</w:t>
+      </w:r>
+      <w:r>
+        <w:t xml:space="preserve"> </w:t>
+      </w:r>
+      <w:r>
+        <w:t>valves</w:t>
+      </w:r>
+      <w:r>
+        <w:t xml:space="preserve"> </w:t>
+      </w:r>
+      <w:r>
+        <w:t>will</w:t>
+      </w:r>
+      <w:r>
+        <w:t xml:space="preserve"> </w:t>
+      </w:r>
+      <w:r>
+        <w:t>recover their functionality, thanks to the saphenous</w:t>
+      </w:r>
+      <w:r>
+        <w:t xml:space="preserve"> </w:t>
+      </w:r>
+      <w:r>
+        <w:t>calibre reduction, thus avoiding the necessity of</w:t>
+      </w:r>
+      <w:r>
+        <w:t xml:space="preserve"> </w:t>
+      </w:r>
+      <w:r>
+        <w:t>a</w:t>
+      </w:r>
+      <w:r>
+        <w:t xml:space="preserve"> </w:t>
+      </w:r>
+      <w:r>
+        <w:t>second</w:t>
+      </w:r>
+      <w:r>
+        <w:t xml:space="preserve"> </w:t>
+      </w:r>
+      <w:r>
+        <w:t>step</w:t>
       </w:r>
       <w:r>
         <w:t>.</w:t>
       </w:r>
       <w:r>
-        <w:t xml:space="preserve"> </w:t>
-      </w:r>
-      <w:r>
-        <w:t>In</w:t>
-      </w:r>
-      <w:r>
-        <w:t xml:space="preserve"> </w:t>
-      </w:r>
-      <w:r>
-        <w:t>case</w:t>
+        <w:t xml:space="preserve"> Type3</w:t>
+      </w:r>
+      <w:r>
+        <w:t xml:space="preserve"> </w:t>
+      </w:r>
+      <w:r>
+        <w:t>shunt</w:t>
+      </w:r>
+      <w:r>
+        <w:t xml:space="preserve"> </w:t>
+      </w:r>
+      <w:r>
+        <w:t>being</w:t>
+      </w:r>
+      <w:r>
+        <w:t xml:space="preserve"> </w:t>
+      </w:r>
+      <w:r>
+        <w:t>transformed</w:t>
+      </w:r>
+      <w:r>
+        <w:t xml:space="preserve"> </w:t>
+      </w:r>
+      <w:r>
+        <w:t>into</w:t>
+      </w:r>
+      <w:r>
+        <w:t xml:space="preserve"> </w:t>
+      </w:r>
+      <w:r>
+        <w:t>a</w:t>
+      </w:r>
+      <w:r>
+        <w:t xml:space="preserve"> </w:t>
+      </w:r>
+      <w:r>
+        <w:t>type1</w:t>
+      </w:r>
+      <w:r>
+        <w:t xml:space="preserve"> </w:t>
+      </w:r>
+      <w:r>
+        <w:t>shunt</w:t>
+      </w:r>
+      <w:r>
+        <w:t xml:space="preserve"> </w:t>
+      </w:r>
+      <w:r>
+        <w:t>by</w:t>
       </w:r>
       <w:r>
         <w:t xml:space="preserve"> </w:t>
@@ -745,7 +901,167 @@
         <w:t xml:space="preserve"> </w:t>
       </w:r>
       <w:r>
-        <w:t>saphenous</w:t>
+        <w:t>first</w:t>
+      </w:r>
+      <w:r>
+        <w:t xml:space="preserve"> </w:t>
+      </w:r>
+      <w:r>
+        <w:t>step</w:t>
+      </w:r>
+      <w:r>
+        <w:t xml:space="preserve"> </w:t>
+      </w:r>
+      <w:r>
+        <w:t>of</w:t>
+      </w:r>
+      <w:r>
+        <w:t xml:space="preserve"> </w:t>
+      </w:r>
+      <w:r>
+        <w:t>a</w:t>
+      </w:r>
+      <w:r>
+        <w:t xml:space="preserve"> </w:t>
+      </w:r>
+      <w:r>
+        <w:t>CHIVA2</w:t>
+      </w:r>
+      <w:r>
+        <w:t xml:space="preserve"> </w:t>
+      </w:r>
+      <w:r>
+        <w:t>procedure</w:t>
+      </w:r>
+      <w:r>
+        <w:t xml:space="preserve"> </w:t>
+      </w:r>
+      <w:r>
+        <w:t>and</w:t>
+      </w:r>
+      <w:r>
+        <w:t xml:space="preserve"> </w:t>
+      </w:r>
+      <w:r>
+        <w:t>then</w:t>
+      </w:r>
+      <w:r>
+        <w:t xml:space="preserve"> </w:t>
+      </w:r>
+      <w:r>
+        <w:t>treated</w:t>
+      </w:r>
+      <w:r>
+        <w:t xml:space="preserve"> </w:t>
+      </w:r>
+      <w:r>
+        <w:t>by</w:t>
+      </w:r>
+      <w:r>
+        <w:t xml:space="preserve"> </w:t>
+      </w:r>
+      <w:r>
+        <w:t>a CHIVA2</w:t>
+      </w:r>
+      <w:r>
+        <w:t xml:space="preserve"> </w:t>
+      </w:r>
+      <w:r>
+        <w:t>second</w:t>
+      </w:r>
+      <w:r>
+        <w:t xml:space="preserve"> </w:t>
+      </w:r>
+      <w:r>
+        <w:t>step</w:t>
+      </w:r>
+      <w:r>
+        <w:t xml:space="preserve"> </w:t>
+      </w:r>
+      <w:proofErr w:type="gramStart"/>
+      <w:r>
+        <w:t>intervention(</w:t>
+      </w:r>
+      <w:proofErr w:type="gramEnd"/>
+      <w:r>
+        <w:t>equal to</w:t>
+      </w:r>
+      <w:r>
+        <w:t xml:space="preserve"> </w:t>
+      </w:r>
+      <w:r>
+        <w:t>CHIVA1)</w:t>
+      </w:r>
+    </w:p>
+    <w:p/>
+    <w:p>
+      <w:r>
+        <w:t xml:space="preserve">Type 2 Shunt ligation </w:t>
+      </w:r>
+      <w:proofErr w:type="gramStart"/>
+      <w:r>
+        <w:t>strategy :</w:t>
+      </w:r>
+      <w:proofErr w:type="gramEnd"/>
+      <w:r>
+        <w:t xml:space="preserve"> </w:t>
+      </w:r>
+      <w:r>
+        <w:t>Considering the type 2 shunt compartment jump (fromN2toN3), it</w:t>
+      </w:r>
+      <w:r>
+        <w:t xml:space="preserve"> </w:t>
+      </w:r>
+      <w:r>
+        <w:t>becomes</w:t>
+      </w:r>
+      <w:r>
+        <w:t xml:space="preserve"> obvious </w:t>
+      </w:r>
+      <w:r>
+        <w:t>show</w:t>
+      </w:r>
+      <w:r>
+        <w:t xml:space="preserve"> </w:t>
+      </w:r>
+      <w:r>
+        <w:t>CHIVA2 first step</w:t>
+      </w:r>
+      <w:r>
+        <w:t xml:space="preserve"> </w:t>
+      </w:r>
+      <w:r>
+        <w:t>represents the</w:t>
+      </w:r>
+      <w:r>
+        <w:t xml:space="preserve"> </w:t>
+      </w:r>
+      <w:r>
+        <w:t>correct indication</w:t>
+      </w:r>
+      <w:r>
+        <w:t xml:space="preserve"> </w:t>
+      </w:r>
+      <w:r>
+        <w:t>also</w:t>
+      </w:r>
+      <w:r>
+        <w:t xml:space="preserve"> </w:t>
+      </w:r>
+      <w:r>
+        <w:t>for</w:t>
+      </w:r>
+      <w:r>
+        <w:t xml:space="preserve"> </w:t>
+      </w:r>
+      <w:r>
+        <w:t>this kind</w:t>
+      </w:r>
+      <w:r>
+        <w:t xml:space="preserve"> </w:t>
+      </w:r>
+      <w:r>
+        <w:t>of</w:t>
       </w:r>
       <w:r>
         <w:t xml:space="preserve"> </w:t>
@@ -757,25 +1073,49 @@
         <w:t xml:space="preserve"> </w:t>
       </w:r>
       <w:r>
-        <w:t>was</w:t>
-      </w:r>
-      <w:r>
-        <w:t xml:space="preserve"> </w:t>
-      </w:r>
-      <w:r>
-        <w:t>fed</w:t>
-      </w:r>
-      <w:r>
-        <w:t xml:space="preserve"> </w:t>
-      </w:r>
-      <w:r>
-        <w:t>just</w:t>
-      </w:r>
-      <w:r>
-        <w:t xml:space="preserve"> </w:t>
-      </w:r>
-      <w:r>
-        <w:t>by</w:t>
+        <w:t>treatment.</w:t>
+      </w:r>
+      <w:r>
+        <w:t xml:space="preserve"> </w:t>
+      </w:r>
+      <w:r>
+        <w:t>No</w:t>
+      </w:r>
+      <w:r>
+        <w:t xml:space="preserve"> </w:t>
+      </w:r>
+      <w:r>
+        <w:t>further</w:t>
+      </w:r>
+      <w:r>
+        <w:t xml:space="preserve"> </w:t>
+      </w:r>
+      <w:r>
+        <w:t>procedures</w:t>
+      </w:r>
+      <w:r>
+        <w:t xml:space="preserve"> </w:t>
+      </w:r>
+      <w:r>
+        <w:t>are</w:t>
+      </w:r>
+      <w:r>
+        <w:t xml:space="preserve"> </w:t>
+      </w:r>
+      <w:r>
+        <w:t>to be</w:t>
+      </w:r>
+      <w:r>
+        <w:t xml:space="preserve"> </w:t>
+      </w:r>
+      <w:r>
+        <w:t>planned</w:t>
+      </w:r>
+      <w:r>
+        <w:t xml:space="preserve"> </w:t>
+      </w:r>
+      <w:r>
+        <w:t>in</w:t>
       </w:r>
       <w:r>
         <w:t xml:space="preserve"> </w:t>
@@ -787,407 +1127,19 @@
         <w:t xml:space="preserve"> </w:t>
       </w:r>
       <w:r>
-        <w:t>vessel</w:t>
-      </w:r>
-      <w:r>
-        <w:t xml:space="preserve"> </w:t>
-      </w:r>
-      <w:r>
-        <w:t>dilation</w:t>
-      </w:r>
-      <w:r>
-        <w:t xml:space="preserve"> </w:t>
-      </w:r>
-      <w:r>
-        <w:t>linked</w:t>
-      </w:r>
-      <w:r>
-        <w:t xml:space="preserve"> </w:t>
-      </w:r>
-      <w:r>
-        <w:t>to</w:t>
-      </w:r>
-      <w:r>
-        <w:t xml:space="preserve"> </w:t>
-      </w:r>
-      <w:r>
-        <w:t>the</w:t>
-      </w:r>
-      <w:r>
-        <w:t xml:space="preserve"> </w:t>
-      </w:r>
-      <w:r>
-        <w:t>N3</w:t>
-      </w:r>
-      <w:r>
-        <w:t xml:space="preserve"> </w:t>
-      </w:r>
-      <w:r>
-        <w:t>aspiration, the</w:t>
-      </w:r>
-      <w:r>
-        <w:t xml:space="preserve"> </w:t>
-      </w:r>
-      <w:r>
-        <w:t>N2</w:t>
-      </w:r>
-      <w:r>
-        <w:t xml:space="preserve"> </w:t>
-      </w:r>
-      <w:r>
-        <w:t>valves</w:t>
-      </w:r>
-      <w:r>
-        <w:t xml:space="preserve"> </w:t>
-      </w:r>
-      <w:r>
-        <w:t>will</w:t>
-      </w:r>
-      <w:r>
-        <w:t xml:space="preserve"> </w:t>
-      </w:r>
-      <w:r>
-        <w:t>recover their functionality, thanks to the saphenous</w:t>
-      </w:r>
-      <w:r>
-        <w:t xml:space="preserve"> </w:t>
-      </w:r>
-      <w:r>
-        <w:t>calibre reduction, thus avoiding the necessity of</w:t>
-      </w:r>
-      <w:r>
-        <w:t xml:space="preserve"> </w:t>
-      </w:r>
-      <w:r>
-        <w:t>a</w:t>
-      </w:r>
-      <w:r>
-        <w:t xml:space="preserve"> </w:t>
-      </w:r>
-      <w:r>
-        <w:t>second</w:t>
-      </w:r>
-      <w:r>
-        <w:t xml:space="preserve"> </w:t>
-      </w:r>
-      <w:r>
-        <w:t>step</w:t>
+        <w:t>type2</w:t>
+      </w:r>
+      <w:r>
+        <w:t xml:space="preserve"> </w:t>
+      </w:r>
+      <w:r>
+        <w:t>shunt</w:t>
       </w:r>
       <w:r>
         <w:t>.</w:t>
       </w:r>
       <w:r>
-        <w:t xml:space="preserve"> </w:t>
-      </w:r>
-      <w:r>
-        <w:t>Type3</w:t>
-      </w:r>
-      <w:r>
-        <w:t xml:space="preserve"> </w:t>
-      </w:r>
-      <w:r>
-        <w:t>shunt</w:t>
-      </w:r>
-      <w:r>
-        <w:t xml:space="preserve"> </w:t>
-      </w:r>
-      <w:r>
-        <w:t>being</w:t>
-      </w:r>
-      <w:r>
-        <w:t xml:space="preserve"> </w:t>
-      </w:r>
-      <w:r>
-        <w:t>transformed</w:t>
-      </w:r>
-      <w:r>
-        <w:t xml:space="preserve"> </w:t>
-      </w:r>
-      <w:r>
-        <w:t>into</w:t>
-      </w:r>
-      <w:r>
-        <w:t xml:space="preserve"> </w:t>
-      </w:r>
-      <w:r>
-        <w:t>a</w:t>
-      </w:r>
-      <w:r>
-        <w:t xml:space="preserve"> </w:t>
-      </w:r>
-      <w:r>
-        <w:t>type1</w:t>
-      </w:r>
-      <w:r>
-        <w:t xml:space="preserve"> </w:t>
-      </w:r>
-      <w:r>
-        <w:t>shunt</w:t>
-      </w:r>
-      <w:r>
-        <w:t xml:space="preserve"> </w:t>
-      </w:r>
-      <w:r>
-        <w:t>by</w:t>
-      </w:r>
-      <w:r>
-        <w:t xml:space="preserve"> </w:t>
-      </w:r>
-      <w:r>
-        <w:t>the</w:t>
-      </w:r>
-      <w:r>
-        <w:t xml:space="preserve"> </w:t>
-      </w:r>
-      <w:r>
-        <w:t>first</w:t>
-      </w:r>
-      <w:r>
-        <w:t xml:space="preserve"> </w:t>
-      </w:r>
-      <w:r>
-        <w:t>step</w:t>
-      </w:r>
-      <w:r>
-        <w:t xml:space="preserve"> </w:t>
-      </w:r>
-      <w:r>
-        <w:t>of</w:t>
-      </w:r>
-      <w:r>
-        <w:t xml:space="preserve"> </w:t>
-      </w:r>
-      <w:r>
-        <w:t>a</w:t>
-      </w:r>
-      <w:r>
-        <w:t xml:space="preserve"> </w:t>
-      </w:r>
-      <w:r>
-        <w:t>CHIVA2</w:t>
-      </w:r>
-      <w:r>
-        <w:t xml:space="preserve"> </w:t>
-      </w:r>
-      <w:r>
-        <w:t>procedure</w:t>
-      </w:r>
-      <w:r>
-        <w:t xml:space="preserve"> </w:t>
-      </w:r>
-      <w:r>
-        <w:t>and</w:t>
-      </w:r>
-      <w:r>
-        <w:t xml:space="preserve"> </w:t>
-      </w:r>
-      <w:r>
-        <w:t>then</w:t>
-      </w:r>
-      <w:r>
-        <w:t xml:space="preserve"> </w:t>
-      </w:r>
-      <w:r>
-        <w:t>treated</w:t>
-      </w:r>
-      <w:r>
-        <w:t xml:space="preserve"> </w:t>
-      </w:r>
-      <w:r>
-        <w:t>by</w:t>
-      </w:r>
-      <w:r>
-        <w:t xml:space="preserve"> </w:t>
-      </w:r>
-      <w:r>
-        <w:t>a CHIVA2</w:t>
-      </w:r>
-      <w:r>
-        <w:t xml:space="preserve"> </w:t>
-      </w:r>
-      <w:r>
-        <w:t>second</w:t>
-      </w:r>
-      <w:r>
-        <w:t xml:space="preserve"> </w:t>
-      </w:r>
-      <w:r>
-        <w:t>step</w:t>
-      </w:r>
-      <w:r>
-        <w:t xml:space="preserve"> </w:t>
-      </w:r>
-      <w:proofErr w:type="gramStart"/>
-      <w:r>
-        <w:t>intervention(</w:t>
-      </w:r>
-      <w:proofErr w:type="gramEnd"/>
-      <w:r>
-        <w:t>equal to</w:t>
-      </w:r>
-      <w:r>
-        <w:t xml:space="preserve"> </w:t>
-      </w:r>
-      <w:r>
-        <w:t>CHIVA1)</w:t>
-      </w:r>
-    </w:p>
-    <w:p/>
-    <w:p>
-      <w:r>
-        <w:t xml:space="preserve">Type </w:t>
-      </w:r>
-      <w:r>
-        <w:t>2</w:t>
-      </w:r>
-      <w:r>
-        <w:t xml:space="preserve"> Shunt ligation </w:t>
-      </w:r>
-      <w:proofErr w:type="gramStart"/>
-      <w:r>
-        <w:t>strategy :</w:t>
-      </w:r>
-      <w:proofErr w:type="gramEnd"/>
-      <w:r>
-        <w:t xml:space="preserve"> </w:t>
-      </w:r>
-      <w:r>
-        <w:t>Considering the type 2 shunt compartment jump (fromN2toN3), it</w:t>
-      </w:r>
-      <w:r>
-        <w:t xml:space="preserve"> </w:t>
-      </w:r>
-      <w:r>
-        <w:t>becomes</w:t>
-      </w:r>
-      <w:r>
-        <w:t xml:space="preserve"> obvious </w:t>
-      </w:r>
-      <w:r>
-        <w:t>show</w:t>
-      </w:r>
-      <w:r>
-        <w:t xml:space="preserve"> </w:t>
-      </w:r>
-      <w:r>
-        <w:t>CHIVA2 first step</w:t>
-      </w:r>
-      <w:r>
-        <w:t xml:space="preserve"> </w:t>
-      </w:r>
-      <w:r>
-        <w:t>represents the</w:t>
-      </w:r>
-      <w:r>
-        <w:t xml:space="preserve"> </w:t>
-      </w:r>
-      <w:r>
-        <w:t>correct indication</w:t>
-      </w:r>
-      <w:r>
-        <w:t xml:space="preserve"> </w:t>
-      </w:r>
-      <w:r>
-        <w:t>also</w:t>
-      </w:r>
-      <w:r>
-        <w:t xml:space="preserve"> </w:t>
-      </w:r>
-      <w:r>
-        <w:t>for</w:t>
-      </w:r>
-      <w:r>
-        <w:t xml:space="preserve"> </w:t>
-      </w:r>
-      <w:r>
-        <w:t>this kind</w:t>
-      </w:r>
-      <w:r>
-        <w:t xml:space="preserve"> </w:t>
-      </w:r>
-      <w:r>
-        <w:t>of</w:t>
-      </w:r>
-      <w:r>
-        <w:t xml:space="preserve"> </w:t>
-      </w:r>
-      <w:r>
-        <w:t>reflux</w:t>
-      </w:r>
-      <w:r>
-        <w:t xml:space="preserve"> </w:t>
-      </w:r>
-      <w:r>
-        <w:t>treatment.</w:t>
-      </w:r>
-      <w:r>
-        <w:t xml:space="preserve"> </w:t>
-      </w:r>
-      <w:r>
-        <w:t>No</w:t>
-      </w:r>
-      <w:r>
-        <w:t xml:space="preserve"> </w:t>
-      </w:r>
-      <w:r>
-        <w:t>further</w:t>
-      </w:r>
-      <w:r>
-        <w:t xml:space="preserve"> </w:t>
-      </w:r>
-      <w:r>
-        <w:t>procedures</w:t>
-      </w:r>
-      <w:r>
-        <w:t xml:space="preserve"> </w:t>
-      </w:r>
-      <w:r>
-        <w:t>are</w:t>
-      </w:r>
-      <w:r>
-        <w:t xml:space="preserve"> </w:t>
-      </w:r>
-      <w:r>
-        <w:t>to be</w:t>
-      </w:r>
-      <w:r>
-        <w:t xml:space="preserve"> </w:t>
-      </w:r>
-      <w:r>
-        <w:t>planned</w:t>
-      </w:r>
-      <w:r>
-        <w:t xml:space="preserve"> </w:t>
-      </w:r>
-      <w:r>
-        <w:t>in</w:t>
-      </w:r>
-      <w:r>
-        <w:t xml:space="preserve"> </w:t>
-      </w:r>
-      <w:r>
-        <w:t>a</w:t>
-      </w:r>
-      <w:r>
-        <w:t xml:space="preserve"> </w:t>
-      </w:r>
-      <w:r>
-        <w:t>type2</w:t>
-      </w:r>
-      <w:r>
-        <w:t xml:space="preserve"> </w:t>
-      </w:r>
-      <w:r>
-        <w:t>shunt</w:t>
-      </w:r>
-      <w:r>
-        <w:t>.</w:t>
-      </w:r>
-      <w:r>
-        <w:t xml:space="preserve"> </w:t>
-      </w:r>
-      <w:r>
-        <w:t>First</w:t>
+        <w:t xml:space="preserve"> First</w:t>
       </w:r>
       <w:r>
         <w:t xml:space="preserve"> </w:t>
@@ -1419,22 +1371,13 @@
     </w:p>
     <w:p>
       <w:r>
-        <w:t xml:space="preserve">The Doppler must be placed cranially to the investigated saphenous RP. If the evoked </w:t>
-      </w:r>
-      <w:r>
-        <w:t>saphenous</w:t>
-      </w:r>
-      <w:r>
-        <w:t xml:space="preserve"> reflux will be eliminated by the N3 escape points compression, the energy gradient addressed to the blood column aspiration through that RP must be considered inefficient. Consequently, it will be mandatory to avoid the high ligation in a single step procedure (CHIVA 1), since dealing with a type 3 shunt</w:t>
+        <w:t>The Doppler must be placed cranially to the investigated saphenous RP. If the evoked saphenous reflux will be eliminated by the N3 escape points compression, the energy gradient addressed to the blood column aspiration through that RP must be considered inefficient. Consequently, it will be mandatory to avoid the high ligation in a single step procedure (CHIVA 1), since dealing with a type 3 shunt</w:t>
       </w:r>
       <w:r>
         <w:t>.</w:t>
       </w:r>
       <w:r>
-        <w:t xml:space="preserve"> </w:t>
-      </w:r>
-      <w:r>
-        <w:t>The correct indication will be a first step of CHIVA 2 procedure</w:t>
+        <w:t xml:space="preserve"> The correct indication will be a first step of CHIVA 2 procedure</w:t>
       </w:r>
       <w:r>
         <w:t>.</w:t>
@@ -1800,10 +1743,7 @@
       </w:r>
       <w:proofErr w:type="gramEnd"/>
       <w:r>
-        <w:t xml:space="preserve"> Perforating veins have always represented an intriguing topic both in the diagnosis and in the treatment of CVD.19,20 Of course, they can constitute the reflux origin (pathological perforating veins) or, conversely, a re-entry point of the reflux itself (physio logical function). Once the leaking points have been identified (N1-N2 and/or N2-N3 junctions), the RP must be found. Whenever there is a reflux, an RP must be expected: this is a consequence of the physical principle for which a flow, or a reflux, can exist only if an energetic gradient is present.2 This diagnostic step is fundamental: a mistake in the RP selection invariably leads to a not draining treated saphenous trunk, thus to a therapy failure.</w:t>
-      </w:r>
-      <w:r>
-        <w:t xml:space="preserve"> </w:t>
+        <w:t xml:space="preserve"> Perforating veins have always represented an intriguing topic both in the diagnosis and in the treatment of CVD.19,20 Of course, they can constitute the reflux origin (pathological perforating veins) or, conversely, a re-entry point of the reflux itself (physio logical function). Once the leaking points have been identified (N1-N2 and/or N2-N3 junctions), the RP must be found. Whenever there is a reflux, an RP must be expected: this is a consequence of the physical principle for which a flow, or a reflux, can exist only if an energetic gradient is present.2 This diagnostic step is fundamental: a mistake in the RP selection invariably leads to a not draining treated saphenous trunk, thus to a therapy failure. </w:t>
       </w:r>
       <w:r>
         <w:t>T</w:t>
@@ -1861,13 +1801,7 @@
         <w:t xml:space="preserve"> </w:t>
       </w:r>
       <w:r>
-        <w:t xml:space="preserve">invasive, accessible under local </w:t>
-      </w:r>
-      <w:r>
-        <w:t>anaesthesia</w:t>
-      </w:r>
-      <w:r>
-        <w:t xml:space="preserve">, in an </w:t>
+        <w:t xml:space="preserve">invasive, accessible under local anaesthesia, in an </w:t>
       </w:r>
       <w:proofErr w:type="gramStart"/>
       <w:r>
@@ -2088,10 +2022,7 @@
       </w:r>
       <w:proofErr w:type="gramEnd"/>
       <w:r>
-        <w:t xml:space="preserve"> make sure that these shunts are not just the diastolic phase of a mixed shunt because the strategy would be different.</w:t>
-      </w:r>
-      <w:r>
-        <w:t xml:space="preserve"> </w:t>
+        <w:t xml:space="preserve"> make sure that these shunts are not just the diastolic phase of a mixed shunt because the strategy would be different. </w:t>
       </w:r>
     </w:p>
     <w:p>
@@ -2112,13 +2043,7 @@
       </w:r>
       <w:proofErr w:type="gramEnd"/>
       <w:r>
-        <w:t xml:space="preserve"> drain the arch and its tributaries through the SFJ. This is not because of the risk of recurrence by the arch tributaries. As a matter of fact, at this point aspiration is weak (no VMP), and terminal valve incompetence does not prevent excessive pressure in the deep network (from coughing, defecating, lifting heavy loads, etc.). For these reasons, the arch and its tributaries are better drained by distal re-entry.</w:t>
-      </w:r>
-      <w:r>
-        <w:t xml:space="preserve"> </w:t>
-      </w:r>
-      <w:r>
-        <w:t xml:space="preserve">When the escape point is an incompetent perforator connected to the saphenous trunk, it remains preferable to disconnect the perforator itself when the corresponding VMP is not efficient. This is the case in the thigh. On the contrary, in the lower region of the leg, disconnection can be performed at the saphenous trunk immediately beneath the incompetent perforator thanks to the efficiency of calf VMP. This efficiency can be assessed by Doppler, which shows </w:t>
+        <w:t xml:space="preserve"> drain the arch and its tributaries through the SFJ. This is not because of the risk of recurrence by the arch tributaries. As a matter of fact, at this point aspiration is weak (no VMP), and terminal valve incompetence does not prevent excessive pressure in the deep network (from coughing, defecating, lifting heavy loads, etc.). For these reasons, the arch and its tributaries are better drained by distal re-entry. When the escape point is an incompetent perforator connected to the saphenous trunk, it remains preferable to disconnect the perforator itself when the corresponding VMP is not efficient. This is the case in the thigh. On the contrary, in the lower region of the leg, disconnection can be performed at the saphenous trunk immediately beneath the incompetent perforator thanks to the efficiency of calf VMP. This efficiency can be assessed by Doppler, which shows </w:t>
       </w:r>
       <w:proofErr w:type="gramStart"/>
       <w:r>
@@ -2317,13 +2242,7 @@
         <w:t>&gt;</w:t>
       </w:r>
       <w:r>
-        <w:t xml:space="preserve">N1. EP can be a pelvic escape point or any other EP. This shunt can appear in congenital malformations but is more usually seen in recurrences following removal of varices and </w:t>
-      </w:r>
-      <w:r>
-        <w:t>saphenous</w:t>
-      </w:r>
-      <w:r>
-        <w:t>.</w:t>
+        <w:t>N1. EP can be a pelvic escape point or any other EP. This shunt can appear in congenital malformations but is more usually seen in recurrences following removal of varices and saphenous.</w:t>
       </w:r>
     </w:p>
     <w:p/>
@@ -3233,6 +3152,7 @@
   <w:style w:type="character" w:default="1" w:styleId="DefaultParagraphFont">
     <w:name w:val="Default Paragraph Font"/>
     <w:uiPriority w:val="1"/>
+    <w:semiHidden/>
     <w:unhideWhenUsed/>
   </w:style>
   <w:style w:type="table" w:default="1" w:styleId="TableNormal">

</xml_diff>